<commit_message>
Document host Escape mapping to native CAPS+1
</commit_message>
<xml_diff>
--- a/docs/ZX-UX C48 SDK Technical Reference.docx
+++ b/docs/ZX-UX C48 SDK Technical Reference.docx
@@ -567,7 +567,7 @@
           <w:rFonts w:ascii="Arial" w:hAnsi="Arial"/>
           <w:sz w:val="18"/>
         </w:rPr>
-        <w:t>15. GUI, Keyboard Rendezvous, BREAK, and Frame Publication</w:t>
+        <w:t>15. GUI, Keyboard Input, BREAK, and Frame Publication</w:t>
       </w:r>
     </w:p>
     <w:p>
@@ -7880,7 +7880,7 @@
         <w:pStyle w:val="Heading1"/>
       </w:pPr>
       <w:r>
-        <w:t>15. GUI, Keyboard Rendezvous, BREAK, and Frame Publication</w:t>
+        <w:t>15. GUI, Keyboard Input, BREAK, and Frame Publication</w:t>
       </w:r>
     </w:p>
     <w:p>
@@ -7896,7 +7896,7 @@
         <w:pStyle w:val="Heading2"/>
       </w:pPr>
       <w:r>
-        <w:t>15.1 Input is a rendezvous</w:t>
+        <w:t>15.1 Input uses a bounded FIFO</w:t>
       </w:r>
     </w:p>
     <w:p>
@@ -7904,7 +7904,7 @@
         <w:pStyle w:val="BodyText"/>
       </w:pPr>
       <w:r>
-        <w:t>Normal host key events are accepted only while the portable SDK VM is blocked inside getchar(). TkDisplay uses a condition variable, a waiting flag, and one key byte. It is deliberately not a typeahead FIFO. Return maps to LF 10, Backspace to 8, Escape to 27, and keypad digits map to their ASCII bytes. Non-ASCII GUI text is ignored.</w:t>
+        <w:t>Normal host key events are translated to canonical C48 console bytes and queued in a bounded FIFO of up to 256 bytes. TkDisplay uses a condition variable and waiting flag so getchar() blocks only when the queue is empty; normal typeahead survives brief gaps between adjacent getchar() calls. Return maps to LF 10, Backspace to 8, Escape to 7, and keypad digits map to their ASCII bytes. Escape is the portable-SDK host equivalent of CAPS+1 on a physical ZX Spectrum running native ZX-UX; byte 7 is the shared control value, not ASCII ESC 27. Non-ASCII GUI text is ignored. This is why write48 leaves INSERT mode with Escape under c48run but CAPS+1 on native hardware.</w:t>
       </w:r>
     </w:p>
     <w:p>
@@ -10925,7 +10925,7 @@
           </w:tcPr>
           <w:p>
             <w:r>
-              <w:t>Portable SDK Tk window, keyboard rendezvous, BREAK, frame generations, probes.</w:t>
+              <w:t>Portable SDK Tk window, keyboard input FIFO, BREAK, frame generations, probes.</w:t>
             </w:r>
           </w:p>
         </w:tc>

</xml_diff>